<commit_message>
Implement comprehensive portfolio risk platform fixes
</commit_message>
<xml_diff>
--- a/QFI_V2_report.docx
+++ b/QFI_V2_report.docx
@@ -11,7 +11,7 @@
           <w:b/>
           <w:sz w:val="28"/>
         </w:rPr>
-        <w:t>Volatility-Scaled Historical Simulation for an Equity Portfolio: Value at Risk, Expected Shortfall, Backtesting and Stress Testing</w:t>
+        <w:t>Advanced Equity Portfolio Risk Management</w:t>
       </w:r>
     </w:p>
     <w:p>
@@ -84,7 +84,7 @@
         <w:pStyle w:val="Heading1"/>
       </w:pPr>
       <w:r>
-        <w:t>1. Introduction and summary</w:t>
+        <w:t>1 Executive Summary</w:t>
       </w:r>
     </w:p>
     <w:p>
@@ -140,7 +140,7 @@
           <w:rFonts w:ascii="Times New Roman" w:hAnsi="Times New Roman"/>
           <w:i w:val="0"/>
         </w:rPr>
-        <w:t>Daily adjusted closing prices are taken from Yahoo Finance, with Tiingo configured as a fallback source. Adjusted prices correct for splits and dividends, so a stock split does not appear as a price collapse. The sample begins in June 2012 because Meta, the most recent listing among the ten names, started trading in May 2012; starting earlier would leave one series incomplete for the first part of the sample. The SPDR S&amp;P 500 ETF (SPY) is used as the market benchmark and the 13-week Treasury bill yield as the risk-free rate. Holdings quoted in other currencies would be converted to US dollars at the daily exchange rate; none of the ten stocks requires it.</w:t>
+        <w:t>Daily adjusted closing prices are taken from Yahoo Finance. The platform also supports Stooq, Tiingo, Alpha Vantage and Polygon through the same source interface, with local cache fallback. Adjusted prices correct for splits and dividends, so a stock split does not appear as a price collapse. The sample begins in June 2012 because Meta, the most recent listing among the ten names, started trading in May 2012; starting earlier would leave one series incomplete for the first part of the sample. The SPDR S&amp;P 500 ETF (SPY) is used as the market benchmark and the 13-week Treasury bill yield as the risk-free rate. Holdings quoted in other currencies would be converted to US dollars at the daily exchange rate; none of the ten stocks requires it.</w:t>
       </w:r>
     </w:p>
     <w:p>
@@ -237,6 +237,9 @@
         <w:gridCol w:w="1134"/>
       </w:tblGrid>
       <w:tr>
+        <w:trPr>
+          <w:tblHeader w:val="true"/>
+        </w:trPr>
         <w:tc>
           <w:tcPr>
             <w:tcW w:type="dxa" w:w="1247"/>
@@ -1899,7 +1902,7 @@
         <w:drawing>
           <wp:inline xmlns:a="http://schemas.openxmlformats.org/drawingml/2006/main" xmlns:pic="http://schemas.openxmlformats.org/drawingml/2006/picture">
             <wp:extent cx="5580000" cy="2566800"/>
-            <wp:docPr id="1" name="Picture 1"/>
+            <wp:docPr id="1" name="Picture 1" title="Figure 1" descr="Value of $1 invested in each stock on 1 June 2012 (log scale). NVIDIA, the best performer, is highlighted."/>
             <wp:cNvGraphicFramePr>
               <a:graphicFrameLocks noChangeAspect="1"/>
             </wp:cNvGraphicFramePr>
@@ -2108,6 +2111,9 @@
         <w:gridCol w:w="1474"/>
       </w:tblGrid>
       <w:tr>
+        <w:trPr>
+          <w:tblHeader w:val="true"/>
+        </w:trPr>
         <w:tc>
           <w:tcPr>
             <w:tcW w:type="dxa" w:w="3628"/>
@@ -2434,108 +2440,6 @@
                 <w:sz w:val="20"/>
               </w:rPr>
               <w:t>-59.5%</w:t>
-            </w:r>
-          </w:p>
-        </w:tc>
-      </w:tr>
-      <w:tr>
-        <w:tc>
-          <w:tcPr>
-            <w:tcW w:type="dxa" w:w="3628"/>
-          </w:tcPr>
-          <w:p>
-            <w:pPr>
-              <w:keepNext/>
-              <w:spacing w:after="0" w:line="240" w:lineRule="auto"/>
-              <w:jc w:val="left"/>
-            </w:pPr>
-            <w:r>
-              <w:rPr>
-                <w:rFonts w:ascii="Times New Roman" w:hAnsi="Times New Roman"/>
-                <w:i w:val="0"/>
-                <w:sz w:val="20"/>
-              </w:rPr>
-              <w:t>Market-cap weight, monthly</w:t>
-            </w:r>
-          </w:p>
-        </w:tc>
-        <w:tc>
-          <w:tcPr>
-            <w:tcW w:type="dxa" w:w="1361"/>
-          </w:tcPr>
-          <w:p>
-            <w:pPr>
-              <w:keepNext/>
-              <w:spacing w:after="0" w:line="240" w:lineRule="auto"/>
-              <w:jc w:val="right"/>
-            </w:pPr>
-            <w:r>
-              <w:rPr>
-                <w:rFonts w:ascii="Times New Roman" w:hAnsi="Times New Roman"/>
-                <w:i w:val="0"/>
-                <w:sz w:val="20"/>
-              </w:rPr>
-              <w:t>24.9%</w:t>
-            </w:r>
-          </w:p>
-        </w:tc>
-        <w:tc>
-          <w:tcPr>
-            <w:tcW w:type="dxa" w:w="1531"/>
-          </w:tcPr>
-          <w:p>
-            <w:pPr>
-              <w:keepNext/>
-              <w:spacing w:after="0" w:line="240" w:lineRule="auto"/>
-              <w:jc w:val="right"/>
-            </w:pPr>
-            <w:r>
-              <w:rPr>
-                <w:rFonts w:ascii="Times New Roman" w:hAnsi="Times New Roman"/>
-                <w:i w:val="0"/>
-                <w:sz w:val="20"/>
-              </w:rPr>
-              <w:t>22.5%</w:t>
-            </w:r>
-          </w:p>
-        </w:tc>
-        <w:tc>
-          <w:tcPr>
-            <w:tcW w:type="dxa" w:w="1247"/>
-          </w:tcPr>
-          <w:p>
-            <w:pPr>
-              <w:keepNext/>
-              <w:spacing w:after="0" w:line="240" w:lineRule="auto"/>
-              <w:jc w:val="right"/>
-            </w:pPr>
-            <w:r>
-              <w:rPr>
-                <w:rFonts w:ascii="Times New Roman" w:hAnsi="Times New Roman"/>
-                <w:i w:val="0"/>
-                <w:sz w:val="20"/>
-              </w:rPr>
-              <w:t>1.01</w:t>
-            </w:r>
-          </w:p>
-        </w:tc>
-        <w:tc>
-          <w:tcPr>
-            <w:tcW w:type="dxa" w:w="1474"/>
-          </w:tcPr>
-          <w:p>
-            <w:pPr>
-              <w:keepNext/>
-              <w:spacing w:after="0" w:line="240" w:lineRule="auto"/>
-              <w:jc w:val="right"/>
-            </w:pPr>
-            <w:r>
-              <w:rPr>
-                <w:rFonts w:ascii="Times New Roman" w:hAnsi="Times New Roman"/>
-                <w:i w:val="0"/>
-                <w:sz w:val="20"/>
-              </w:rPr>
-              <w:t>-39.7%</w:t>
             </w:r>
           </w:p>
         </w:tc>
@@ -2677,7 +2581,7 @@
           <w:i w:val="0"/>
           <w:sz w:val="20"/>
         </w:rPr>
-        <w:t xml:space="preserve"> Sharpe ratios use a flat 2% risk-free rate because T-bill data were unavailable for this run. The S&amp;P 500 (SPY) returned 15.2% a year over the same period. Market-cap weights use current share counts throughout.</w:t>
+        <w:t xml:space="preserve"> Sharpe ratios use a flat 2% risk-free rate because T-bill data were unavailable for this run. The S&amp;P 500 (SPY) returned 15.2% a year over the same period. The platform's market-capitalisation rule is excluded from this retrospective table unless dated shares outstanding cover every rebalance date.</w:t>
       </w:r>
     </w:p>
     <w:p>
@@ -2702,7 +2606,7 @@
         <w:drawing>
           <wp:inline xmlns:a="http://schemas.openxmlformats.org/drawingml/2006/main" xmlns:pic="http://schemas.openxmlformats.org/drawingml/2006/picture">
             <wp:extent cx="5580000" cy="2008800"/>
-            <wp:docPr id="2" name="Picture 2"/>
+            <wp:docPr id="2" name="Picture 2" title="Figure 2" descr="Drawdown of the equally weighted portfolio: the percentage fall from the highest value reached to date."/>
             <wp:cNvGraphicFramePr>
               <a:graphicFrameLocks noChangeAspect="1"/>
             </wp:cNvGraphicFramePr>
@@ -2773,7 +2677,7 @@
         <w:drawing>
           <wp:inline xmlns:a="http://schemas.openxmlformats.org/drawingml/2006/main" xmlns:pic="http://schemas.openxmlformats.org/drawingml/2006/picture">
             <wp:extent cx="5040000" cy="1915200"/>
-            <wp:docPr id="3" name="Picture 3"/>
+            <wp:docPr id="3" name="Picture 3" title="Figure 3" descr="Histogram of daily portfolio returns against a normal density with the same mean and variance."/>
             <wp:cNvGraphicFramePr>
               <a:graphicFrameLocks noChangeAspect="1"/>
             </wp:cNvGraphicFramePr>
@@ -3351,6 +3255,9 @@
         <w:gridCol w:w="2268"/>
       </w:tblGrid>
       <w:tr>
+        <w:trPr>
+          <w:tblHeader w:val="true"/>
+        </w:trPr>
         <w:tc>
           <w:tcPr>
             <w:tcW w:type="dxa" w:w="3402"/>
@@ -4047,7 +3954,7 @@
         <w:drawing>
           <wp:inline xmlns:a="http://schemas.openxmlformats.org/drawingml/2006/main" xmlns:pic="http://schemas.openxmlformats.org/drawingml/2006/picture">
             <wp:extent cx="5580000" cy="2232000"/>
-            <wp:docPr id="4" name="Picture 4"/>
+            <wp:docPr id="4" name="Picture 4" title="Figure 4" descr="Annualised conditional volatility of the portfolio: 63-day rolling standard deviation, EWMA (λ = 0.94), GARCH(1,1) and GJR-GARCH(1,1)."/>
             <wp:cNvGraphicFramePr>
               <a:graphicFrameLocks noChangeAspect="1"/>
             </wp:cNvGraphicFramePr>
@@ -4106,7 +4013,7 @@
         <w:drawing>
           <wp:inline xmlns:a="http://schemas.openxmlformats.org/drawingml/2006/main" xmlns:pic="http://schemas.openxmlformats.org/drawingml/2006/picture">
             <wp:extent cx="5040000" cy="1915200"/>
-            <wp:docPr id="5" name="Picture 5"/>
+            <wp:docPr id="5" name="Picture 5" title="Figure 5" descr="Average absolute daily return over the five days following a day in each return bucket. No model is involved."/>
             <wp:cNvGraphicFramePr>
               <a:graphicFrameLocks noChangeAspect="1"/>
             </wp:cNvGraphicFramePr>
@@ -4355,6 +4262,9 @@
         <w:gridCol w:w="1644"/>
       </w:tblGrid>
       <w:tr>
+        <w:trPr>
+          <w:tblHeader w:val="true"/>
+        </w:trPr>
         <w:tc>
           <w:tcPr>
             <w:tcW w:type="dxa" w:w="1587"/>
@@ -5057,7 +4967,7 @@
         <w:drawing>
           <wp:inline xmlns:a="http://schemas.openxmlformats.org/drawingml/2006/main" xmlns:pic="http://schemas.openxmlformats.org/drawingml/2006/picture">
             <wp:extent cx="5040000" cy="1915200"/>
-            <wp:docPr id="6" name="Picture 6"/>
+            <wp:docPr id="6" name="Picture 6" title="Figure 6" descr="The 500 GJR-scaled scenarios for tomorrow's profit and loss with the 99% VaR and ES marked."/>
             <wp:cNvGraphicFramePr>
               <a:graphicFrameLocks noChangeAspect="1"/>
             </wp:cNvGraphicFramePr>
@@ -5379,6 +5289,9 @@
         <w:gridCol w:w="963"/>
       </w:tblGrid>
       <w:tr>
+        <w:trPr>
+          <w:tblHeader w:val="true"/>
+        </w:trPr>
         <w:tc>
           <w:tcPr>
             <w:tcW w:type="dxa" w:w="1361"/>
@@ -6405,7 +6318,7 @@
         <w:drawing>
           <wp:inline xmlns:a="http://schemas.openxmlformats.org/drawingml/2006/main" xmlns:pic="http://schemas.openxmlformats.org/drawingml/2006/picture">
             <wp:extent cx="5580000" cy="2343600"/>
-            <wp:docPr id="7" name="Picture 7"/>
+            <wp:docPr id="7" name="Picture 7" title="Figure 7" descr="Daily P&amp;L in 2020 against the one-day 99% VaR of the HS and GJR-HS models, both computed with data available at the time."/>
             <wp:cNvGraphicFramePr>
               <a:graphicFrameLocks noChangeAspect="1"/>
             </wp:cNvGraphicFramePr>
@@ -6464,7 +6377,7 @@
         <w:drawing>
           <wp:inline xmlns:a="http://schemas.openxmlformats.org/drawingml/2006/main" xmlns:pic="http://schemas.openxmlformats.org/drawingml/2006/picture">
             <wp:extent cx="5040000" cy="1512000"/>
-            <wp:docPr id="8" name="Picture 8"/>
+            <wp:docPr id="8" name="Picture 8" title="Figure 8" descr="Dates of 99% VaR exceptions by model, June 2014 to October 2026."/>
             <wp:cNvGraphicFramePr>
               <a:graphicFrameLocks noChangeAspect="1"/>
             </wp:cNvGraphicFramePr>
@@ -6571,6 +6484,9 @@
         <w:gridCol w:w="793"/>
       </w:tblGrid>
       <w:tr>
+        <w:trPr>
+          <w:tblHeader w:val="true"/>
+        </w:trPr>
         <w:tc>
           <w:tcPr>
             <w:tcW w:type="dxa" w:w="1304"/>
@@ -7516,6 +7432,9 @@
         <w:gridCol w:w="1247"/>
       </w:tblGrid>
       <w:tr>
+        <w:trPr>
+          <w:tblHeader w:val="true"/>
+        </w:trPr>
         <w:tc>
           <w:tcPr>
             <w:tcW w:type="dxa" w:w="1361"/>
@@ -8417,6 +8336,9 @@
         <w:gridCol w:w="1134"/>
       </w:tblGrid>
       <w:tr>
+        <w:trPr>
+          <w:tblHeader w:val="true"/>
+        </w:trPr>
         <w:tc>
           <w:tcPr>
             <w:tcW w:type="dxa" w:w="2835"/>
@@ -10095,7 +10017,7 @@
         <w:drawing>
           <wp:inline xmlns:a="http://schemas.openxmlformats.org/drawingml/2006/main" xmlns:pic="http://schemas.openxmlformats.org/drawingml/2006/picture">
             <wp:extent cx="5220000" cy="2505600"/>
-            <wp:docPr id="9" name="Picture 9"/>
+            <wp:docPr id="9" name="Picture 9" title="Figure 9" descr="Loss on the current portfolio under each stress scenario. Dark bars are historical replays, light bars hypothetical shocks."/>
             <wp:cNvGraphicFramePr>
               <a:graphicFrameLocks noChangeAspect="1"/>
             </wp:cNvGraphicFramePr>
@@ -10174,7 +10096,7 @@
         <w:drawing>
           <wp:inline xmlns:a="http://schemas.openxmlformats.org/drawingml/2006/main" xmlns:pic="http://schemas.openxmlformats.org/drawingml/2006/picture">
             <wp:extent cx="5040000" cy="1915200"/>
-            <wp:docPr id="10" name="Picture 10"/>
+            <wp:docPr id="10" name="Picture 10" title="Figure 10" descr="Share of portfolio value and share of 99% ES contributed by each stock (GJR-HS scenarios)."/>
             <wp:cNvGraphicFramePr>
               <a:graphicFrameLocks noChangeAspect="1"/>
             </wp:cNvGraphicFramePr>
@@ -10252,7 +10174,7 @@
           <w:rFonts w:ascii="Times New Roman" w:hAnsi="Times New Roman"/>
           <w:i w:val="0"/>
         </w:rPr>
-        <w:t>Several simplifications qualify the results. The universe is ten large US stocks that are in the sample because they exist and are large today, so the data carry survivorship bias and the high average returns should not be read as expected returns. The ten-day figures rely on the square-root-of-time rule, which ignores volatility mean reversion and the autocorrelation found in Section 3. The GARCH parameters are estimated with normal innovations; a Student-t specification is available in the platform but was not used for the reported results. With roughly 31 expected exceptions at 99%, the backtests have limited power, and the independence test in particular can only detect fairly strong clustering; Section 7 shows that a later start date is enough to move the 99% verdict on GJR-HS across the 5% line. Stand-ins for stocks that did not trade in 2008 assume that their market sensitivity was the same then as now. Market-capitalisation weights use today's share counts throughout the sample. Finally, the data come from a single free vendor; the Tiingo fallback reduces but does not remove that dependence.</w:t>
+        <w:t>Several simplifications qualify the results. The universe is ten large US stocks that are in the sample because they exist and are large today, so the data carry survivorship bias and the high average returns should not be read as expected returns. The ten-day figures rely on the square-root-of-time rule, which ignores volatility mean reversion and the autocorrelation found in Section 3. The GARCH parameters are estimated with normal innovations; a Student-t specification is available in the platform but was not used for the reported results. With roughly 31 expected exceptions at 99%, the backtests have limited power, and the independence test in particular can only detect fairly strong clustering; Section 7 shows that a later start date is enough to move the 99% verdict on GJR-HS across the 5% line. Stand-ins for stocks that did not trade in 2008 assume that their market sensitivity was the same then as now. A historical market-capitalisation portfolio can only be built when dated shares outstanding cover every rebalance date; the implementation stops when that history is missing rather than carrying today's share count into the past. The reported results use one vendor's saved prices, so a production process should reconcile prices against an independent source.</w:t>
       </w:r>
     </w:p>
     <w:p>
@@ -10272,7 +10194,7 @@
           <w:rFonts w:ascii="Times New Roman" w:hAnsi="Times New Roman"/>
           <w:i w:val="0"/>
         </w:rPr>
-        <w:t>Four extensions would address these points. Simulating ten-day paths from the fitted GJR model, rather than scaling the one-day figure, would capture mean reversion in volatility. A Student-t or skewed-t innovation distribution could be compared with the normal specification using the same backtests. An ES backtest, such as that of Acerbi and Szekely (2014), would test the tail beyond VaR directly, which matters now that the Basel framework uses ES for capital. A point-in-time universe, rebuilt from historical index membership, would remove the survivorship bias.</w:t>
+        <w:t>Four extensions would address these points. Simulating ten-day paths from the fitted GJR model, rather than scaling the one-day figure, would capture mean reversion in volatility. A Student-t or skewed-t innovation distribution could be compared with the normal specification using the same backtests. An ES backtest, such as that of Acerbi and Szekely (2014), would test the tail beyond VaR directly, which matters now that the Basel framework uses ES for capital. A point-in-time universe rebuilt from historical index membership would remove survivorship bias. Historical share counts should also be archived with each research run so market-capitalisation weights remain reproducible.</w:t>
       </w:r>
     </w:p>
     <w:p>

</xml_diff>